<commit_message>
Dse dejan funcionales los checkbox para filtrar los registros totales
</commit_message>
<xml_diff>
--- a/src/main/resources/reports/informe_general_otrosi_7_cctv.docx
+++ b/src/main/resources/reports/informe_general_otrosi_7_cctv.docx
@@ -1096,6 +1096,9 @@
                 <w:rFonts w:ascii="Calibri" w:hAnsi="Calibri" w:cs="Calibri"/>
               </w:rPr>
             </w:pPr>
+            <w:r>
+              <w:t>1</w:t>
+            </w:r>
           </w:p>
         </w:tc>
         <w:tc>
@@ -1111,6 +1114,9 @@
                 <w:rFonts w:ascii="Calibri" w:hAnsi="Calibri" w:cs="Calibri"/>
               </w:rPr>
             </w:pPr>
+            <w:r>
+              <w:t>16/03/2026</w:t>
+            </w:r>
           </w:p>
         </w:tc>
         <w:tc>
@@ -1126,6 +1132,9 @@
                 <w:rFonts w:cs="Calibri"/>
               </w:rPr>
             </w:pPr>
+            <w:r>
+              <w:t>Mantenimiento Preventivo</w:t>
+            </w:r>
           </w:p>
         </w:tc>
         <w:tc>
@@ -1141,6 +1150,9 @@
                 <w:rFonts w:ascii="Calibri" w:hAnsi="Calibri" w:cs="Calibri"/>
               </w:rPr>
             </w:pPr>
+            <w:r>
+              <w:t>Morgue-01</w:t>
+            </w:r>
           </w:p>
         </w:tc>
         <w:tc>
@@ -1157,6 +1169,9 @@
                 <w:bCs/>
               </w:rPr>
             </w:pPr>
+            <w:r>
+              <w:t>Centro Morgue</w:t>
+            </w:r>
           </w:p>
         </w:tc>
         <w:tc>
@@ -1168,6 +1183,9 @@
             <w:pPr>
               <w:jc w:val="center"/>
             </w:pPr>
+            <w:r>
+              <w:t>Agregar foto</w:t>
+            </w:r>
           </w:p>
         </w:tc>
         <w:tc>
@@ -1202,6 +1220,9 @@
                 <w:rFonts w:ascii="Calibri" w:hAnsi="Calibri" w:cs="Calibri"/>
               </w:rPr>
             </w:pPr>
+            <w:r>
+              <w:t>2</w:t>
+            </w:r>
           </w:p>
         </w:tc>
         <w:tc>
@@ -1217,6 +1238,9 @@
                 <w:rFonts w:ascii="Calibri" w:hAnsi="Calibri" w:cs="Calibri"/>
               </w:rPr>
             </w:pPr>
+            <w:r>
+              <w:t>16/03/2026</w:t>
+            </w:r>
           </w:p>
         </w:tc>
         <w:tc>
@@ -1232,6 +1256,9 @@
                 <w:rFonts w:cs="Calibri"/>
               </w:rPr>
             </w:pPr>
+            <w:r>
+              <w:t>Mantenimiento Preventivo</w:t>
+            </w:r>
           </w:p>
         </w:tc>
         <w:tc>
@@ -1247,6 +1274,9 @@
                 <w:rFonts w:ascii="Calibri" w:hAnsi="Calibri" w:cs="Calibri"/>
               </w:rPr>
             </w:pPr>
+            <w:r>
+              <w:t>DIRECTORY RD</w:t>
+            </w:r>
           </w:p>
         </w:tc>
         <w:tc>
@@ -1262,6 +1292,9 @@
                 <w:rFonts w:ascii="Calibri" w:hAnsi="Calibri" w:cs="Calibri"/>
               </w:rPr>
             </w:pPr>
+            <w:r>
+              <w:t>BD2</w:t>
+            </w:r>
           </w:p>
         </w:tc>
         <w:tc>
@@ -1273,6 +1306,9 @@
             <w:pPr>
               <w:jc w:val="center"/>
             </w:pPr>
+            <w:r>
+              <w:t>Agregar foto</w:t>
+            </w:r>
           </w:p>
         </w:tc>
         <w:tc>
@@ -1307,6 +1343,9 @@
                 <w:rFonts w:ascii="Calibri" w:hAnsi="Calibri" w:cs="Calibri"/>
               </w:rPr>
             </w:pPr>
+            <w:r>
+              <w:t>3</w:t>
+            </w:r>
           </w:p>
         </w:tc>
         <w:tc>
@@ -1322,6 +1361,9 @@
                 <w:rFonts w:ascii="Calibri" w:hAnsi="Calibri" w:cs="Calibri"/>
               </w:rPr>
             </w:pPr>
+            <w:r>
+              <w:t>16/03/2026</w:t>
+            </w:r>
           </w:p>
         </w:tc>
         <w:tc>
@@ -1337,6 +1379,9 @@
                 <w:rFonts w:cs="Calibri"/>
               </w:rPr>
             </w:pPr>
+            <w:r>
+              <w:t>Mantenimiento Preventivo</w:t>
+            </w:r>
           </w:p>
         </w:tc>
         <w:tc>
@@ -1352,6 +1397,9 @@
                 <w:rFonts w:ascii="Calibri" w:hAnsi="Calibri" w:cs="Calibri"/>
               </w:rPr>
             </w:pPr>
+            <w:r>
+              <w:t>CISA-09</w:t>
+            </w:r>
           </w:p>
         </w:tc>
         <w:tc>
@@ -1367,6 +1415,9 @@
                 <w:rFonts w:ascii="Calibri" w:hAnsi="Calibri" w:cs="Calibri"/>
               </w:rPr>
             </w:pPr>
+            <w:r>
+              <w:t>CISA rampa</w:t>
+            </w:r>
           </w:p>
         </w:tc>
         <w:tc>
@@ -1378,6 +1429,9 @@
             <w:pPr>
               <w:jc w:val="center"/>
             </w:pPr>
+            <w:r>
+              <w:t>Agregar foto</w:t>
+            </w:r>
           </w:p>
         </w:tc>
         <w:tc>
@@ -1412,6 +1466,9 @@
                 <w:rFonts w:ascii="Calibri" w:hAnsi="Calibri" w:cs="Calibri"/>
               </w:rPr>
             </w:pPr>
+            <w:r>
+              <w:t>4</w:t>
+            </w:r>
           </w:p>
         </w:tc>
         <w:tc>
@@ -1427,6 +1484,9 @@
                 <w:rFonts w:ascii="Calibri" w:hAnsi="Calibri" w:cs="Calibri"/>
               </w:rPr>
             </w:pPr>
+            <w:r>
+              <w:t>16/03/2026</w:t>
+            </w:r>
           </w:p>
         </w:tc>
         <w:tc>
@@ -1442,6 +1502,9 @@
                 <w:rFonts w:cs="Calibri"/>
               </w:rPr>
             </w:pPr>
+            <w:r>
+              <w:t>Mantenimiento Preventivo</w:t>
+            </w:r>
           </w:p>
         </w:tc>
         <w:tc>
@@ -1457,6 +1520,9 @@
                 <w:rFonts w:ascii="Calibri" w:hAnsi="Calibri" w:cs="Calibri"/>
               </w:rPr>
             </w:pPr>
+            <w:r>
+              <w:t>1-46-2A</w:t>
+            </w:r>
           </w:p>
         </w:tc>
         <w:tc>
@@ -1472,6 +1538,9 @@
                 <w:rFonts w:ascii="Calibri" w:hAnsi="Calibri" w:cs="Calibri"/>
               </w:rPr>
             </w:pPr>
+            <w:r>
+              <w:t>PLATAFORMA, FRENTE A PUENTE 88</w:t>
+            </w:r>
           </w:p>
         </w:tc>
         <w:tc>
@@ -1483,6 +1552,9 @@
             <w:pPr>
               <w:jc w:val="center"/>
             </w:pPr>
+            <w:r>
+              <w:t>Agregar foto</w:t>
+            </w:r>
           </w:p>
         </w:tc>
         <w:tc>
@@ -1517,6 +1589,9 @@
                 <w:rFonts w:ascii="Calibri" w:hAnsi="Calibri" w:cs="Calibri"/>
               </w:rPr>
             </w:pPr>
+            <w:r>
+              <w:t>5</w:t>
+            </w:r>
           </w:p>
         </w:tc>
         <w:tc>
@@ -1532,6 +1607,9 @@
                 <w:rFonts w:ascii="Calibri" w:hAnsi="Calibri" w:cs="Calibri"/>
               </w:rPr>
             </w:pPr>
+            <w:r>
+              <w:t>16/03/2026</w:t>
+            </w:r>
           </w:p>
         </w:tc>
         <w:tc>
@@ -1547,6 +1625,9 @@
                 <w:rFonts w:cs="Calibri"/>
               </w:rPr>
             </w:pPr>
+            <w:r>
+              <w:t>Mantenimiento Preventivo</w:t>
+            </w:r>
           </w:p>
         </w:tc>
         <w:tc>
@@ -1562,6 +1643,9 @@
                 <w:rFonts w:ascii="Calibri" w:hAnsi="Calibri" w:cs="Calibri"/>
               </w:rPr>
             </w:pPr>
+            <w:r>
+              <w:t>ARCHIVER 5 RD</w:t>
+            </w:r>
           </w:p>
         </w:tc>
         <w:tc>
@@ -1577,6 +1661,9 @@
                 <w:rFonts w:ascii="Calibri" w:hAnsi="Calibri" w:cs="Calibri"/>
               </w:rPr>
             </w:pPr>
+            <w:r>
+              <w:t>BD2</w:t>
+            </w:r>
           </w:p>
         </w:tc>
         <w:tc>
@@ -1588,6 +1675,9 @@
             <w:pPr>
               <w:jc w:val="center"/>
             </w:pPr>
+            <w:r>
+              <w:t>Agregar foto</w:t>
+            </w:r>
           </w:p>
         </w:tc>
         <w:tc>
@@ -1622,6 +1712,9 @@
                 <w:rFonts w:ascii="Calibri" w:hAnsi="Calibri" w:cs="Calibri"/>
               </w:rPr>
             </w:pPr>
+            <w:r>
+              <w:t>6</w:t>
+            </w:r>
           </w:p>
         </w:tc>
         <w:tc>
@@ -1637,6 +1730,9 @@
                 <w:rFonts w:ascii="Calibri" w:hAnsi="Calibri" w:cs="Calibri"/>
               </w:rPr>
             </w:pPr>
+            <w:r>
+              <w:t>16/03/2026</w:t>
+            </w:r>
           </w:p>
         </w:tc>
         <w:tc>
@@ -1652,6 +1748,9 @@
                 <w:rFonts w:cs="Calibri"/>
               </w:rPr>
             </w:pPr>
+            <w:r>
+              <w:t>Mantenimiento Preventivo</w:t>
+            </w:r>
           </w:p>
         </w:tc>
         <w:tc>
@@ -1667,6 +1766,9 @@
                 <w:rFonts w:ascii="Calibri" w:hAnsi="Calibri" w:cs="Calibri"/>
               </w:rPr>
             </w:pPr>
+            <w:r>
+              <w:t>1-22-01</w:t>
+            </w:r>
           </w:p>
         </w:tc>
         <w:tc>
@@ -1682,6 +1784,9 @@
                 <w:rFonts w:ascii="Calibri" w:hAnsi="Calibri" w:cs="Calibri"/>
               </w:rPr>
             </w:pPr>
+            <w:r>
+              <w:t>PASILLO ALFRENTE RECHEKIN AV</w:t>
+            </w:r>
           </w:p>
         </w:tc>
         <w:tc>
@@ -1693,6 +1798,9 @@
             <w:pPr>
               <w:jc w:val="center"/>
             </w:pPr>
+            <w:r>
+              <w:t>Agregar foto</w:t>
+            </w:r>
           </w:p>
         </w:tc>
         <w:tc>
@@ -1727,6 +1835,9 @@
                 <w:rFonts w:ascii="Calibri" w:hAnsi="Calibri" w:cs="Calibri"/>
               </w:rPr>
             </w:pPr>
+            <w:r>
+              <w:t>7</w:t>
+            </w:r>
           </w:p>
         </w:tc>
         <w:tc>
@@ -1742,6 +1853,9 @@
                 <w:rFonts w:ascii="Calibri" w:hAnsi="Calibri" w:cs="Calibri"/>
               </w:rPr>
             </w:pPr>
+            <w:r>
+              <w:t>17/03/2026</w:t>
+            </w:r>
           </w:p>
         </w:tc>
         <w:tc>
@@ -1757,6 +1871,9 @@
                 <w:rFonts w:cs="Calibri"/>
               </w:rPr>
             </w:pPr>
+            <w:r>
+              <w:t>Mantenimiento Preventivo</w:t>
+            </w:r>
           </w:p>
         </w:tc>
         <w:tc>
@@ -1772,6 +1889,9 @@
                 <w:rFonts w:ascii="Calibri" w:hAnsi="Calibri" w:cs="Calibri"/>
               </w:rPr>
             </w:pPr>
+            <w:r>
+              <w:t>2-10-01</w:t>
+            </w:r>
           </w:p>
         </w:tc>
         <w:tc>
@@ -1787,6 +1907,9 @@
                 <w:rFonts w:ascii="Calibri" w:hAnsi="Calibri" w:cs="Calibri"/>
               </w:rPr>
             </w:pPr>
+            <w:r>
+              <w:t>FD 2039 ENTRADA</w:t>
+            </w:r>
           </w:p>
         </w:tc>
         <w:tc>
@@ -1798,6 +1921,9 @@
             <w:pPr>
               <w:jc w:val="center"/>
             </w:pPr>
+            <w:r>
+              <w:t>Agregar foto</w:t>
+            </w:r>
           </w:p>
         </w:tc>
         <w:tc>
@@ -1832,6 +1958,9 @@
                 <w:rFonts w:ascii="Calibri" w:hAnsi="Calibri" w:cs="Calibri"/>
               </w:rPr>
             </w:pPr>
+            <w:r>
+              <w:t>8</w:t>
+            </w:r>
           </w:p>
         </w:tc>
         <w:tc>
@@ -1847,6 +1976,9 @@
                 <w:rFonts w:ascii="Calibri" w:hAnsi="Calibri" w:cs="Calibri"/>
               </w:rPr>
             </w:pPr>
+            <w:r>
+              <w:t>17/03/2026</w:t>
+            </w:r>
           </w:p>
         </w:tc>
         <w:tc>
@@ -1862,6 +1994,9 @@
                 <w:rFonts w:cs="Calibri"/>
               </w:rPr>
             </w:pPr>
+            <w:r>
+              <w:t>Mantenimiento Preventivo</w:t>
+            </w:r>
           </w:p>
         </w:tc>
         <w:tc>
@@ -1877,6 +2012,9 @@
                 <w:rFonts w:ascii="Calibri" w:hAnsi="Calibri" w:cs="Calibri"/>
               </w:rPr>
             </w:pPr>
+            <w:r>
+              <w:t>1-22-02</w:t>
+            </w:r>
           </w:p>
         </w:tc>
         <w:tc>
@@ -1892,6 +2030,9 @@
                 <w:rFonts w:ascii="Calibri" w:hAnsi="Calibri" w:cs="Calibri"/>
               </w:rPr>
             </w:pPr>
+            <w:r>
+              <w:t xml:space="preserve">BANDA 8 NACIONAL </w:t>
+            </w:r>
           </w:p>
         </w:tc>
         <w:tc>
@@ -1903,6 +2044,9 @@
             <w:pPr>
               <w:jc w:val="center"/>
             </w:pPr>
+            <w:r>
+              <w:t>Agregar foto</w:t>
+            </w:r>
           </w:p>
         </w:tc>
         <w:tc>
@@ -1934,6 +2078,9 @@
             <w:pPr>
               <w:jc w:val="center"/>
             </w:pPr>
+            <w:r>
+              <w:t>9</w:t>
+            </w:r>
           </w:p>
         </w:tc>
         <w:tc>
@@ -1946,6 +2093,9 @@
             <w:pPr>
               <w:jc w:val="center"/>
             </w:pPr>
+            <w:r>
+              <w:t>17/03/2026</w:t>
+            </w:r>
           </w:p>
         </w:tc>
         <w:tc>
@@ -1958,6 +2108,9 @@
             <w:pPr>
               <w:jc w:val="center"/>
             </w:pPr>
+            <w:r>
+              <w:t>Mantenimiento Preventivo</w:t>
+            </w:r>
           </w:p>
         </w:tc>
         <w:tc>
@@ -1970,6 +2123,9 @@
             <w:pPr>
               <w:jc w:val="center"/>
             </w:pPr>
+            <w:r>
+              <w:t>1-38-02</w:t>
+            </w:r>
           </w:p>
         </w:tc>
         <w:tc>
@@ -1982,6 +2138,9 @@
             <w:pPr>
               <w:jc w:val="center"/>
             </w:pPr>
+            <w:r>
+              <w:t xml:space="preserve">PUENTE DE ABORDAJE 79 PLATAFORMA </w:t>
+            </w:r>
           </w:p>
         </w:tc>
         <w:tc>
@@ -1993,6 +2152,9 @@
             <w:pPr>
               <w:jc w:val="center"/>
             </w:pPr>
+            <w:r>
+              <w:t>Agregar foto</w:t>
+            </w:r>
           </w:p>
         </w:tc>
         <w:tc>
@@ -2024,6 +2186,9 @@
             <w:pPr>
               <w:jc w:val="center"/>
             </w:pPr>
+            <w:r>
+              <w:t>10</w:t>
+            </w:r>
           </w:p>
         </w:tc>
         <w:tc>
@@ -2036,6 +2201,9 @@
             <w:pPr>
               <w:jc w:val="center"/>
             </w:pPr>
+            <w:r>
+              <w:t>17/03/2026</w:t>
+            </w:r>
           </w:p>
         </w:tc>
         <w:tc>
@@ -2048,6 +2216,9 @@
             <w:pPr>
               <w:jc w:val="center"/>
             </w:pPr>
+            <w:r>
+              <w:t>Mantenimiento Preventivo</w:t>
+            </w:r>
           </w:p>
         </w:tc>
         <w:tc>
@@ -2060,6 +2231,9 @@
             <w:pPr>
               <w:jc w:val="center"/>
             </w:pPr>
+            <w:r>
+              <w:t>1-20-10</w:t>
+            </w:r>
           </w:p>
         </w:tc>
         <w:tc>
@@ -2071,6 +2245,9 @@
             <w:pPr>
               <w:jc w:val="center"/>
             </w:pPr>
+            <w:r>
+              <w:t>Puerta 8 Catam</w:t>
+            </w:r>
           </w:p>
         </w:tc>
         <w:tc>
@@ -2082,6 +2259,9 @@
             <w:pPr>
               <w:jc w:val="center"/>
             </w:pPr>
+            <w:r>
+              <w:t>Agregar foto</w:t>
+            </w:r>
           </w:p>
         </w:tc>
         <w:tc>
@@ -2113,6 +2293,9 @@
             <w:pPr>
               <w:jc w:val="center"/>
             </w:pPr>
+            <w:r>
+              <w:t>11</w:t>
+            </w:r>
           </w:p>
         </w:tc>
         <w:tc>
@@ -2125,6 +2308,9 @@
             <w:pPr>
               <w:jc w:val="center"/>
             </w:pPr>
+            <w:r>
+              <w:t>19/03/2026</w:t>
+            </w:r>
           </w:p>
         </w:tc>
         <w:tc>
@@ -2137,6 +2323,9 @@
             <w:pPr>
               <w:jc w:val="center"/>
             </w:pPr>
+            <w:r>
+              <w:t>Mantenimiento Preventivo</w:t>
+            </w:r>
           </w:p>
         </w:tc>
         <w:tc>
@@ -2149,6 +2338,9 @@
             <w:pPr>
               <w:jc w:val="center"/>
             </w:pPr>
+            <w:r>
+              <w:t>1-36-02</w:t>
+            </w:r>
           </w:p>
         </w:tc>
         <w:tc>
@@ -2160,6 +2352,9 @@
             <w:pPr>
               <w:jc w:val="center"/>
             </w:pPr>
+            <w:r>
+              <w:t>PLAT CERCA SALA 93</w:t>
+            </w:r>
           </w:p>
         </w:tc>
         <w:tc>
@@ -2171,6 +2366,9 @@
             <w:pPr>
               <w:jc w:val="center"/>
             </w:pPr>
+            <w:r>
+              <w:t>Agregar foto</w:t>
+            </w:r>
           </w:p>
         </w:tc>
         <w:tc>
@@ -2202,6 +2400,9 @@
             <w:pPr>
               <w:jc w:val="center"/>
             </w:pPr>
+            <w:r>
+              <w:t>12</w:t>
+            </w:r>
           </w:p>
         </w:tc>
         <w:tc>
@@ -2214,6 +2415,9 @@
             <w:pPr>
               <w:jc w:val="center"/>
             </w:pPr>
+            <w:r>
+              <w:t>19/03/2026</w:t>
+            </w:r>
           </w:p>
         </w:tc>
         <w:tc>
@@ -2226,6 +2430,9 @@
             <w:pPr>
               <w:jc w:val="center"/>
             </w:pPr>
+            <w:r>
+              <w:t>Mantenimiento Preventivo</w:t>
+            </w:r>
           </w:p>
         </w:tc>
         <w:tc>
@@ -2238,6 +2445,9 @@
             <w:pPr>
               <w:jc w:val="center"/>
             </w:pPr>
+            <w:r>
+              <w:t>1-22-14</w:t>
+            </w:r>
           </w:p>
         </w:tc>
         <w:tc>
@@ -2249,6 +2459,9 @@
             <w:pPr>
               <w:jc w:val="center"/>
             </w:pPr>
+            <w:r>
+              <w:t xml:space="preserve">ASCENSOR PANORAMICO </w:t>
+            </w:r>
           </w:p>
         </w:tc>
         <w:tc>
@@ -2260,6 +2473,9 @@
             <w:pPr>
               <w:jc w:val="center"/>
             </w:pPr>
+            <w:r>
+              <w:t>Agregar foto</w:t>
+            </w:r>
           </w:p>
         </w:tc>
         <w:tc>

</xml_diff>

<commit_message>
se avanza con el back, se modifica controller, service y model del sacs para poder llamar ubicacion de la DB neon
</commit_message>
<xml_diff>
--- a/src/main/resources/reports/informe_general_otrosi_7_cctv.docx
+++ b/src/main/resources/reports/informe_general_otrosi_7_cctv.docx
@@ -2507,6 +2507,9 @@
             <w:pPr>
               <w:jc w:val="center"/>
             </w:pPr>
+            <w:r>
+              <w:t>13</w:t>
+            </w:r>
           </w:p>
         </w:tc>
         <w:tc>
@@ -2519,6 +2522,9 @@
             <w:pPr>
               <w:jc w:val="center"/>
             </w:pPr>
+            <w:r>
+              <w:t>19/03/2026</w:t>
+            </w:r>
           </w:p>
         </w:tc>
         <w:tc>
@@ -2531,6 +2537,9 @@
             <w:pPr>
               <w:jc w:val="center"/>
             </w:pPr>
+            <w:r>
+              <w:t>Mantenimiento Preventivo</w:t>
+            </w:r>
           </w:p>
         </w:tc>
         <w:tc>
@@ -2543,6 +2552,9 @@
             <w:pPr>
               <w:jc w:val="center"/>
             </w:pPr>
+            <w:r>
+              <w:t>0-16-01</w:t>
+            </w:r>
           </w:p>
         </w:tc>
         <w:tc>
@@ -2554,6 +2566,9 @@
             <w:pPr>
               <w:jc w:val="center"/>
             </w:pPr>
+            <w:r>
+              <w:t>CARCAMO BHS</w:t>
+            </w:r>
           </w:p>
         </w:tc>
         <w:tc>
@@ -2565,6 +2580,9 @@
             <w:pPr>
               <w:jc w:val="center"/>
             </w:pPr>
+            <w:r>
+              <w:t>Agregar foto</w:t>
+            </w:r>
           </w:p>
         </w:tc>
         <w:tc>

</xml_diff>